<commit_message>
Cover letter com revisores sugeridos; S1 descreve os ótimos uniformes e a camada B espacial (aproximação Poisson declarada)
Co-Authored-By: Claude Opus 5.5 <noreply@anthropic.com>
</commit_message>
<xml_diff>
--- a/manuscript/cover_letter.docx
+++ b/manuscript/cover_letter.docx
@@ -103,7 +103,71 @@
         <w:pStyle w:val="BodyText"/>
       </w:pPr>
       <w:r>
-        <w:t xml:space="preserve">This manuscript has not been published and is not under consideration for publication elsewhere. The author declares no conflict of interest. [CITAR: suggested and opposed reviewers, if any]</w:t>
+        <w:t xml:space="preserve">This manuscript has not been published and is not under consideration for publication elsewhere. The author declares no conflict of interest.</w:t>
+      </w:r>
+    </w:p>
+    <w:p>
+      <w:pPr>
+        <w:pStyle w:val="BodyText"/>
+      </w:pPr>
+      <w:r>
+        <w:t xml:space="preserve">We suggest the following reviewers, who have published on the methods evaluated here and on the simulation of metacommunities, and with whom the author has not collaborated:</w:t>
+      </w:r>
+    </w:p>
+    <w:p>
+      <w:pPr>
+        <w:pStyle w:val="BodyText"/>
+      </w:pPr>
+      <w:r>
+        <w:t xml:space="preserve">Sandrine Pavoine, Muséum national d’Histoire naturelle and CNRS, Paris, France (phylogenetic dissimilarity measures among sites, evoPCA) [CITAR: e-mail]</w:t>
+      </w:r>
+    </w:p>
+    <w:p>
+      <w:pPr>
+        <w:pStyle w:val="BodyText"/>
+      </w:pPr>
+      <w:r>
+        <w:t xml:space="preserve">Cajo J. F. ter Braak, Wageningen University &amp; Research, Wageningen, the Netherlands (permutation tests of trait– and phylogeny–environment relationships, the max test) [CITAR: e-mail]</w:t>
+      </w:r>
+    </w:p>
+    <w:p>
+      <w:pPr>
+        <w:pStyle w:val="BodyText"/>
+      </w:pPr>
+      <w:r>
+        <w:t xml:space="preserve">David Zelený, National Taiwan University, Taipei, Taiwan (type I error of community-weighted mean approaches) [CITAR: e-mail]</w:t>
+      </w:r>
+    </w:p>
+    <w:p>
+      <w:pPr>
+        <w:pStyle w:val="BodyText"/>
+      </w:pPr>
+      <w:r>
+        <w:t xml:space="preserve">Tamara Münkemüller, CNRS, Laboratoire d’Écologie Alpine, Grenoble, France (phylogenetic signal and inference of assembly rules from diversity patterns) [CITAR: e-mail]</w:t>
+      </w:r>
+    </w:p>
+    <w:p>
+      <w:pPr>
+        <w:pStyle w:val="BodyText"/>
+      </w:pPr>
+      <w:r>
+        <w:t xml:space="preserve">Patrick L. Thompson, Fisheries and Oceans Canada and University of British Columbia, Canada (process-based metacommunity models) [CITAR: e-mail]</w:t>
+      </w:r>
+    </w:p>
+    <w:p>
+      <w:pPr>
+        <w:pStyle w:val="BodyText"/>
+      </w:pPr>
+      <w:r>
+        <w:t xml:space="preserve">Steven W. Kembel, Université du Québec à Montréal, Montréal, Canada (performance of community phylogenetic structure tests) [CITAR: e-mail]</w:t>
+      </w:r>
+    </w:p>
+    <w:p>
+      <w:pPr>
+        <w:pStyle w:val="BodyText"/>
+      </w:pPr>
+      <w:r>
+        <w:t xml:space="preserve">We have no opposed reviewers.</w:t>
       </w:r>
     </w:p>
     <w:p>

</xml_diff>

<commit_message>
Revisores com e-mail fora do git (cópia de submissão da cover letter); log de IA e memória atualizados
Co-Authored-By: Claude Opus 5.5 <noreply@anthropic.com>
</commit_message>
<xml_diff>
--- a/manuscript/cover_letter.docx
+++ b/manuscript/cover_letter.docx
@@ -119,47 +119,47 @@
         <w:pStyle w:val="BodyText"/>
       </w:pPr>
       <w:r>
-        <w:t xml:space="preserve">Sandrine Pavoine, Muséum national d’Histoire naturelle and CNRS, Paris, France (phylogenetic dissimilarity measures among sites, evoPCA) [CITAR: e-mail]</w:t>
-      </w:r>
-    </w:p>
-    <w:p>
-      <w:pPr>
-        <w:pStyle w:val="BodyText"/>
-      </w:pPr>
-      <w:r>
-        <w:t xml:space="preserve">Cajo J. F. ter Braak, Wageningen University &amp; Research, Wageningen, the Netherlands (permutation tests of trait– and phylogeny–environment relationships, the max test) [CITAR: e-mail]</w:t>
-      </w:r>
-    </w:p>
-    <w:p>
-      <w:pPr>
-        <w:pStyle w:val="BodyText"/>
-      </w:pPr>
-      <w:r>
-        <w:t xml:space="preserve">David Zelený, National Taiwan University, Taipei, Taiwan (type I error of community-weighted mean approaches) [CITAR: e-mail]</w:t>
-      </w:r>
-    </w:p>
-    <w:p>
-      <w:pPr>
-        <w:pStyle w:val="BodyText"/>
-      </w:pPr>
-      <w:r>
-        <w:t xml:space="preserve">Tamara Münkemüller, CNRS, Laboratoire d’Écologie Alpine, Grenoble, France (phylogenetic signal and inference of assembly rules from diversity patterns) [CITAR: e-mail]</w:t>
-      </w:r>
-    </w:p>
-    <w:p>
-      <w:pPr>
-        <w:pStyle w:val="BodyText"/>
-      </w:pPr>
-      <w:r>
-        <w:t xml:space="preserve">Patrick L. Thompson, Fisheries and Oceans Canada and University of British Columbia, Canada (process-based metacommunity models) [CITAR: e-mail]</w:t>
-      </w:r>
-    </w:p>
-    <w:p>
-      <w:pPr>
-        <w:pStyle w:val="BodyText"/>
-      </w:pPr>
-      <w:r>
-        <w:t xml:space="preserve">Steven W. Kembel, Université du Québec à Montréal, Montréal, Canada (performance of community phylogenetic structure tests) [CITAR: e-mail]</w:t>
+        <w:t xml:space="preserve">Sandrine Pavoine, Muséum national d’Histoire naturelle and CNRS, Paris, France (phylogenetic dissimilarity measures among sites, evoPCA) REVIEWER_EMAIL_Pavoine</w:t>
+      </w:r>
+    </w:p>
+    <w:p>
+      <w:pPr>
+        <w:pStyle w:val="BodyText"/>
+      </w:pPr>
+      <w:r>
+        <w:t xml:space="preserve">Cajo J. F. ter Braak, Wageningen University &amp; Research, Wageningen, the Netherlands (permutation tests of trait– and phylogeny–environment relationships, the max test) REVIEWER_EMAIL_ter_Braak</w:t>
+      </w:r>
+    </w:p>
+    <w:p>
+      <w:pPr>
+        <w:pStyle w:val="BodyText"/>
+      </w:pPr>
+      <w:r>
+        <w:t xml:space="preserve">David Zelený, National Taiwan University, Taipei, Taiwan (type I error of community-weighted mean approaches) REVIEWER_EMAIL_Zelený</w:t>
+      </w:r>
+    </w:p>
+    <w:p>
+      <w:pPr>
+        <w:pStyle w:val="BodyText"/>
+      </w:pPr>
+      <w:r>
+        <w:t xml:space="preserve">Tamara Münkemüller, CNRS, Laboratoire d’Écologie Alpine, Grenoble, France (phylogenetic signal and inference of assembly rules from diversity patterns) REVIEWER_EMAIL_Münkemüller</w:t>
+      </w:r>
+    </w:p>
+    <w:p>
+      <w:pPr>
+        <w:pStyle w:val="BodyText"/>
+      </w:pPr>
+      <w:r>
+        <w:t xml:space="preserve">Patrick L. Thompson, Fisheries and Oceans Canada and University of British Columbia, Canada (process-based metacommunity models) REVIEWER_EMAIL_Thompson</w:t>
+      </w:r>
+    </w:p>
+    <w:p>
+      <w:pPr>
+        <w:pStyle w:val="BodyText"/>
+      </w:pPr>
+      <w:r>
+        <w:t xml:space="preserve">Steven W. Kembel, Université du Québec à Montréal, Montréal, Canada (performance of community phylogenetic structure tests) REVIEWER_EMAIL_Kembel</w:t>
       </w:r>
     </w:p>
     <w:p>

</xml_diff>